<commit_message>
Update Lista 2 - correção exercicios 6-10.docx
</commit_message>
<xml_diff>
--- a/Curso_Em_JAVA/Aula 5/exercicios/Lista 2 - correção exercicios 6-10.docx
+++ b/Curso_Em_JAVA/Aula 5/exercicios/Lista 2 - correção exercicios 6-10.docx
@@ -4,7 +4,7 @@
   <w:body>
     <w:p>
       <w:pPr>
-        <w:spacing w:after="0"/>
+        <w:ind w:left="360"/>
         <w:rPr>
           <w:sz w:val="32"/>
           <w:szCs w:val="32"/>
@@ -15,21 +15,21 @@
           <w:sz w:val="32"/>
           <w:szCs w:val="32"/>
         </w:rPr>
-        <w:t xml:space="preserve">Lista de Exercícios </w:t>
+        <w:t>Lista de Exercícios 02 Aula 5 (</w:t>
       </w:r>
       <w:r>
         <w:rPr>
           <w:sz w:val="32"/>
           <w:szCs w:val="32"/>
         </w:rPr>
-        <w:t>02</w:t>
+        <w:t>6-10</w:t>
       </w:r>
       <w:r>
         <w:rPr>
           <w:sz w:val="32"/>
           <w:szCs w:val="32"/>
         </w:rPr>
-        <w:t xml:space="preserve"> (Estrutura Condicionais)</w:t>
+        <w:t xml:space="preserve"> Estrutura Condicionais)</w:t>
       </w:r>
       <w:r>
         <w:rPr>

</xml_diff>